<commit_message>
Audit fixes: dead code, private imports, and CLI error handling
Removed three dead members, two of which an earlier pass had half-removed --
the @property decorators were stripped but the methods left behind.

config._REGISTRY was being imported across modules; replaced with a registry()
accessor, since a module-level name would be captured at import time by
whichever module imported it first -- the same trap ALL_METRICS avoids by
mutating in place.

A typo in a custom metric definition dumped a stack trace in front of a client;
it now reports the file and the problem. An explicitly-named metrics file that
does not exist is an error rather than a silent run with none of the user's
metrics.

Co-Authored-By: Claude Opus 5 <noreply@anthropic.com>
</commit_message>
<xml_diff>
--- a/output/benchmark_report.docx
+++ b/output/benchmark_report.docx
@@ -691,192 +691,6 @@
           </w:p>
         </w:tc>
       </w:tr>
-      <w:tr>
-        <w:tc>
-          <w:tcPr>
-            <w:tcW w:type="dxa" w:w="1440"/>
-          </w:tcPr>
-          <w:p>
-            <w:r>
-              <w:t>Portfolio turnover</w:t>
-            </w:r>
-          </w:p>
-        </w:tc>
-        <w:tc>
-          <w:tcPr>
-            <w:tcW w:type="dxa" w:w="1440"/>
-          </w:tcPr>
-          <w:p>
-            <w:r>
-              <w:t>— no figure located in filings</w:t>
-            </w:r>
-          </w:p>
-        </w:tc>
-        <w:tc>
-          <w:tcPr>
-            <w:tcW w:type="dxa" w:w="1440"/>
-          </w:tcPr>
-          <w:p>
-            <w:r>
-              <w:t>— no figure within staleness window</w:t>
-            </w:r>
-          </w:p>
-        </w:tc>
-        <w:tc>
-          <w:tcPr>
-            <w:tcW w:type="dxa" w:w="1440"/>
-          </w:tcPr>
-          <w:p>
-            <w:r>
-              <w:t>13.00% (Low)</w:t>
-            </w:r>
-          </w:p>
-        </w:tc>
-        <w:tc>
-          <w:tcPr>
-            <w:tcW w:type="dxa" w:w="1440"/>
-          </w:tcPr>
-          <w:p>
-            <w:r>
-              <w:t>— no figure located in filings</w:t>
-            </w:r>
-          </w:p>
-        </w:tc>
-        <w:tc>
-          <w:tcPr>
-            <w:tcW w:type="dxa" w:w="1440"/>
-          </w:tcPr>
-          <w:p>
-            <w:r>
-              <w:t>— not reported at this basis</w:t>
-            </w:r>
-          </w:p>
-        </w:tc>
-      </w:tr>
-      <w:tr>
-        <w:tc>
-          <w:tcPr>
-            <w:tcW w:type="dxa" w:w="1440"/>
-          </w:tcPr>
-          <w:p>
-            <w:r>
-              <w:t>Non-accrual rate (% of portfolio)</w:t>
-            </w:r>
-          </w:p>
-        </w:tc>
-        <w:tc>
-          <w:tcPr>
-            <w:tcW w:type="dxa" w:w="1440"/>
-          </w:tcPr>
-          <w:p>
-            <w:r>
-              <w:t>— no figure located in filings</w:t>
-            </w:r>
-          </w:p>
-        </w:tc>
-        <w:tc>
-          <w:tcPr>
-            <w:tcW w:type="dxa" w:w="1440"/>
-          </w:tcPr>
-          <w:p>
-            <w:r>
-              <w:t>— no figure located in filings</w:t>
-            </w:r>
-          </w:p>
-        </w:tc>
-        <w:tc>
-          <w:tcPr>
-            <w:tcW w:type="dxa" w:w="1440"/>
-          </w:tcPr>
-          <w:p>
-            <w:r>
-              <w:t>— no figure located in filings</w:t>
-            </w:r>
-          </w:p>
-        </w:tc>
-        <w:tc>
-          <w:tcPr>
-            <w:tcW w:type="dxa" w:w="1440"/>
-          </w:tcPr>
-          <w:p>
-            <w:r>
-              <w:t>0.30% (Low)</w:t>
-            </w:r>
-          </w:p>
-        </w:tc>
-        <w:tc>
-          <w:tcPr>
-            <w:tcW w:type="dxa" w:w="1440"/>
-          </w:tcPr>
-          <w:p>
-            <w:r>
-              <w:t>— no figure located in filings</w:t>
-            </w:r>
-          </w:p>
-        </w:tc>
-      </w:tr>
-      <w:tr>
-        <w:tc>
-          <w:tcPr>
-            <w:tcW w:type="dxa" w:w="1440"/>
-          </w:tcPr>
-          <w:p>
-            <w:r>
-              <w:t>Weighted average spread (bps)</w:t>
-            </w:r>
-          </w:p>
-        </w:tc>
-        <w:tc>
-          <w:tcPr>
-            <w:tcW w:type="dxa" w:w="1440"/>
-          </w:tcPr>
-          <w:p>
-            <w:r>
-              <w:t>— no figure located in filings</w:t>
-            </w:r>
-          </w:p>
-        </w:tc>
-        <w:tc>
-          <w:tcPr>
-            <w:tcW w:type="dxa" w:w="1440"/>
-          </w:tcPr>
-          <w:p>
-            <w:r>
-              <w:t>— no figure located in filings</w:t>
-            </w:r>
-          </w:p>
-        </w:tc>
-        <w:tc>
-          <w:tcPr>
-            <w:tcW w:type="dxa" w:w="1440"/>
-          </w:tcPr>
-          <w:p>
-            <w:r>
-              <w:t>— no figure located in filings</w:t>
-            </w:r>
-          </w:p>
-        </w:tc>
-        <w:tc>
-          <w:tcPr>
-            <w:tcW w:type="dxa" w:w="1440"/>
-          </w:tcPr>
-          <w:p>
-            <w:r>
-              <w:t>— no figure located in filings</w:t>
-            </w:r>
-          </w:p>
-        </w:tc>
-        <w:tc>
-          <w:tcPr>
-            <w:tcW w:type="dxa" w:w="1440"/>
-          </w:tcPr>
-          <w:p>
-            <w:r>
-              <w:t>— no figure located in filings</w:t>
-            </w:r>
-          </w:p>
-        </w:tc>
-      </w:tr>
     </w:tbl>
     <w:p>
       <w:r>
@@ -909,7 +723,7 @@
         <w:rPr>
           <w:sz w:val="20"/>
         </w:rPr>
-        <w:t>28 of 48 competitor cells are populated. Each empty cell is attributed below so it can be read as a known limit rather than an unexplained gap.</w:t>
+        <w:t>26 of 36 competitor cells are populated. Each empty cell is attributed below so it can be read as a known limit rather than an unexplained gap.</w:t>
       </w:r>
     </w:p>
     <w:p>
@@ -920,106 +734,7 @@
         <w:rPr>
           <w:sz w:val="20"/>
         </w:rPr>
-        <w:t>Extraction we have not built (8)</w:t>
-      </w:r>
-    </w:p>
-    <w:p>
-      <w:pPr>
-        <w:pStyle w:val="ListBullet"/>
-      </w:pPr>
-      <w:r>
-        <w:rPr>
-          <w:sz w:val="20"/>
-        </w:rPr>
-        <w:t>CCLFX — Non-accrual rate (% of portfolio): no EDGAR source located; either extraction we have not built, or the figure is not in the filings at all -- see the caveat below</w:t>
-      </w:r>
-    </w:p>
-    <w:p>
-      <w:pPr>
-        <w:pStyle w:val="ListBullet"/>
-      </w:pPr>
-      <w:r>
-        <w:rPr>
-          <w:sz w:val="20"/>
-        </w:rPr>
-        <w:t>CCLFX — Weighted average spread (bps): no EDGAR source located; either extraction we have not built, or the figure is not in the filings at all -- see the caveat below</w:t>
-      </w:r>
-    </w:p>
-    <w:p>
-      <w:pPr>
-        <w:pStyle w:val="ListBullet"/>
-      </w:pPr>
-      <w:r>
-        <w:rPr>
-          <w:sz w:val="20"/>
-        </w:rPr>
-        <w:t>GBDC — Portfolio turnover: no EDGAR source located; either extraction we have not built, or the figure is not in the filings at all -- see the caveat below</w:t>
-      </w:r>
-    </w:p>
-    <w:p>
-      <w:pPr>
-        <w:pStyle w:val="ListBullet"/>
-      </w:pPr>
-      <w:r>
-        <w:rPr>
-          <w:sz w:val="20"/>
-        </w:rPr>
-        <w:t>GBDC — Weighted average spread (bps): no EDGAR source located; either extraction we have not built, or the figure is not in the filings at all -- see the caveat below</w:t>
-      </w:r>
-    </w:p>
-    <w:p>
-      <w:pPr>
-        <w:pStyle w:val="ListBullet"/>
-      </w:pPr>
-      <w:r>
-        <w:rPr>
-          <w:sz w:val="20"/>
-        </w:rPr>
-        <w:t>KREF — Non-accrual rate (% of portfolio): no EDGAR source located; either extraction we have not built, or the figure is not in the filings at all -- see the caveat below</w:t>
-      </w:r>
-    </w:p>
-    <w:p>
-      <w:pPr>
-        <w:pStyle w:val="ListBullet"/>
-      </w:pPr>
-      <w:r>
-        <w:rPr>
-          <w:sz w:val="20"/>
-        </w:rPr>
-        <w:t>KREF — Weighted average spread (bps): no EDGAR source located; either extraction we have not built, or the figure is not in the filings at all -- see the caveat below</w:t>
-      </w:r>
-    </w:p>
-    <w:p>
-      <w:pPr>
-        <w:pStyle w:val="ListBullet"/>
-      </w:pPr>
-      <w:r>
-        <w:rPr>
-          <w:sz w:val="20"/>
-        </w:rPr>
-        <w:t>TAKIX — Non-accrual rate (% of portfolio): no EDGAR source located; either extraction we have not built, or the figure is not in the filings at all -- see the caveat below</w:t>
-      </w:r>
-    </w:p>
-    <w:p>
-      <w:pPr>
-        <w:pStyle w:val="ListBullet"/>
-      </w:pPr>
-      <w:r>
-        <w:rPr>
-          <w:sz w:val="20"/>
-        </w:rPr>
-        <w:t>TAKIX — Weighted average spread (bps): no EDGAR source located; either extraction we have not built, or the figure is not in the filings at all -- see the caveat below</w:t>
-      </w:r>
-    </w:p>
-    <w:p>
-      <w:pPr>
-        <w:pStyle w:val="Heading2"/>
-      </w:pPr>
-      <w:r>
-        <w:rPr>
-          <w:sz w:val="20"/>
-        </w:rPr>
-        <w:t>Exists, but outside the six-month staleness window (5)</w:t>
+        <w:t>Exists, but outside the six-month staleness window (4)</w:t>
       </w:r>
     </w:p>
     <w:p>
@@ -1068,17 +783,6 @@
     </w:p>
     <w:p>
       <w:pPr>
-        <w:pStyle w:val="ListBullet"/>
-      </w:pPr>
-      <w:r>
-        <w:rPr>
-          <w:sz w:val="20"/>
-        </w:rPr>
-        <w:t>CCLFX — Portfolio turnover: figure exists but predates the six-month line</w:t>
-      </w:r>
-    </w:p>
-    <w:p>
-      <w:pPr>
         <w:pStyle w:val="Heading2"/>
       </w:pPr>
       <w:r>
@@ -1107,7 +811,7 @@
         <w:rPr>
           <w:sz w:val="20"/>
         </w:rPr>
-        <w:t>Not published by the filer; no work would fix these (6)</w:t>
+        <w:t>Not published by the filer; no work would fix these (5)</w:t>
       </w:r>
     </w:p>
     <w:p>
@@ -1163,17 +867,6 @@
           <w:sz w:val="20"/>
         </w:rPr>
         <w:t>KREF — Net return, trailing 5Y (ann.): filer does not publish this concept; no extraction would fix it</w:t>
-      </w:r>
-    </w:p>
-    <w:p>
-      <w:pPr>
-        <w:pStyle w:val="ListBullet"/>
-      </w:pPr>
-      <w:r>
-        <w:rPr>
-          <w:sz w:val="20"/>
-        </w:rPr>
-        <w:t>KREF — Portfolio turnover: filer does not publish this concept; no extraction would fix it</w:t>
       </w:r>
     </w:p>
     <w:p>
@@ -1697,90 +1390,6 @@
           <w:p>
             <w:r>
               <w:t>9.22% (delta withheld)</w:t>
-            </w:r>
-          </w:p>
-        </w:tc>
-      </w:tr>
-      <w:tr>
-        <w:tc>
-          <w:tcPr>
-            <w:tcW w:type="dxa" w:w="2160"/>
-          </w:tcPr>
-          <w:p>
-            <w:r>
-              <w:t>Portfolio turnover</w:t>
-            </w:r>
-          </w:p>
-        </w:tc>
-        <w:tc>
-          <w:tcPr>
-            <w:tcW w:type="dxa" w:w="2160"/>
-          </w:tcPr>
-          <w:p>
-            <w:r>
-              <w:t>13.00%</w:t>
-            </w:r>
-          </w:p>
-        </w:tc>
-        <w:tc>
-          <w:tcPr>
-            <w:tcW w:type="dxa" w:w="2160"/>
-          </w:tcPr>
-          <w:p>
-            <w:r>
-              <w:t>13.00% – 13.00%</w:t>
-            </w:r>
-          </w:p>
-        </w:tc>
-        <w:tc>
-          <w:tcPr>
-            <w:tcW w:type="dxa" w:w="2160"/>
-          </w:tcPr>
-          <w:p>
-            <w:r>
-              <w:t>—</w:t>
-            </w:r>
-          </w:p>
-        </w:tc>
-      </w:tr>
-      <w:tr>
-        <w:tc>
-          <w:tcPr>
-            <w:tcW w:type="dxa" w:w="2160"/>
-          </w:tcPr>
-          <w:p>
-            <w:r>
-              <w:t>Non-accrual rate (% of portfolio)</w:t>
-            </w:r>
-          </w:p>
-        </w:tc>
-        <w:tc>
-          <w:tcPr>
-            <w:tcW w:type="dxa" w:w="2160"/>
-          </w:tcPr>
-          <w:p>
-            <w:r>
-              <w:t>0.30%</w:t>
-            </w:r>
-          </w:p>
-        </w:tc>
-        <w:tc>
-          <w:tcPr>
-            <w:tcW w:type="dxa" w:w="2160"/>
-          </w:tcPr>
-          <w:p>
-            <w:r>
-              <w:t>0.30% – 0.30%</w:t>
-            </w:r>
-          </w:p>
-        </w:tc>
-        <w:tc>
-          <w:tcPr>
-            <w:tcW w:type="dxa" w:w="2160"/>
-          </w:tcPr>
-          <w:p>
-            <w:r>
-              <w:t>—</w:t>
             </w:r>
           </w:p>
         </w:tc>
@@ -2382,48 +1991,6 @@
           </w:tcPr>
           <w:p>
             <w:r>
-              <w:t>TAKIX</w:t>
-            </w:r>
-          </w:p>
-        </w:tc>
-        <w:tc>
-          <w:tcPr>
-            <w:tcW w:type="dxa" w:w="2160"/>
-          </w:tcPr>
-          <w:p>
-            <w:r>
-              <w:t>Portfolio turnover</w:t>
-            </w:r>
-          </w:p>
-        </w:tc>
-        <w:tc>
-          <w:tcPr>
-            <w:tcW w:type="dxa" w:w="2160"/>
-          </w:tcPr>
-          <w:p>
-            <w:r>
-              <w:t>N-CSR, period 2025-12-31, acc. 0001725472-26-000003</w:t>
-            </w:r>
-          </w:p>
-        </w:tc>
-        <w:tc>
-          <w:tcPr>
-            <w:tcW w:type="dxa" w:w="2160"/>
-          </w:tcPr>
-          <w:p>
-            <w:r>
-              <w:t>financial highlights, CLASS I, row matching 'portfolio turnover', most recent column</w:t>
-            </w:r>
-          </w:p>
-        </w:tc>
-      </w:tr>
-      <w:tr>
-        <w:tc>
-          <w:tcPr>
-            <w:tcW w:type="dxa" w:w="2160"/>
-          </w:tcPr>
-          <w:p>
-            <w:r>
               <w:t>GBDC</w:t>
             </w:r>
           </w:p>
@@ -2749,48 +2316,6 @@
           <w:p>
             <w:r>
               <w:t>XBRL us-gaap:CommonStockDividendsPerShareDeclared [USD/shares] @ 2025-10-01..2025-12-31 (run-rate annualized)</w:t>
-            </w:r>
-          </w:p>
-        </w:tc>
-      </w:tr>
-      <w:tr>
-        <w:tc>
-          <w:tcPr>
-            <w:tcW w:type="dxa" w:w="2160"/>
-          </w:tcPr>
-          <w:p>
-            <w:r>
-              <w:t>GBDC</w:t>
-            </w:r>
-          </w:p>
-        </w:tc>
-        <w:tc>
-          <w:tcPr>
-            <w:tcW w:type="dxa" w:w="2160"/>
-          </w:tcPr>
-          <w:p>
-            <w:r>
-              <w:t>Non-accrual rate (% of portfolio)</w:t>
-            </w:r>
-          </w:p>
-        </w:tc>
-        <w:tc>
-          <w:tcPr>
-            <w:tcW w:type="dxa" w:w="2160"/>
-          </w:tcPr>
-          <w:p>
-            <w:r>
-              <w:t>10-K, period 2025-09-30, acc. 0001476765-25-000096</w:t>
-            </w:r>
-          </w:p>
-        </w:tc>
-        <w:tc>
-          <w:tcPr>
-            <w:tcW w:type="dxa" w:w="2160"/>
-          </w:tcPr>
-          <w:p>
-            <w:r>
-              <w:t>custom metric 'non_accrual_rate_pct' @ char 4115622</w:t>
             </w:r>
           </w:p>
         </w:tc>

</xml_diff>

<commit_message>
Remove three questions from the final window by building the answers
The consultation window is the scarce resource, so work that converts a blocking
question into a choice is worth more than the feature itself.

Fund search now runs on EDGAR full-text search -- the only SEC index that sees
non-traded interval funds. It finds CCLFX and returns its ticker, which the
ticker files omit entirely, and it works where browse-edgar times out. Removes
the question of whether the browser can reach the fund types they care about.

Peer sets persist via --save-peers / --peers, as readable JSON so the CIO who
owns the peer list can inspect it without running anything.

Non-accrual now ships on both cost and fair-value bases as two metrics, using
the metric registry itself. GBDC reports 0.6% and 0.3% in one sentence; shipping
both makes the basis a render choice rather than a question that blocks
extraction.

Co-Authored-By: Claude Opus 5 <noreply@anthropic.com>
</commit_message>
<xml_diff>
--- a/output/benchmark_report.docx
+++ b/output/benchmark_report.docx
@@ -691,6 +691,254 @@
           </w:p>
         </w:tc>
       </w:tr>
+      <w:tr>
+        <w:tc>
+          <w:tcPr>
+            <w:tcW w:type="dxa" w:w="1440"/>
+          </w:tcPr>
+          <w:p>
+            <w:r>
+              <w:t>Portfolio turnover</w:t>
+            </w:r>
+          </w:p>
+        </w:tc>
+        <w:tc>
+          <w:tcPr>
+            <w:tcW w:type="dxa" w:w="1440"/>
+          </w:tcPr>
+          <w:p>
+            <w:r>
+              <w:t>— no figure located in filings</w:t>
+            </w:r>
+          </w:p>
+        </w:tc>
+        <w:tc>
+          <w:tcPr>
+            <w:tcW w:type="dxa" w:w="1440"/>
+          </w:tcPr>
+          <w:p>
+            <w:r>
+              <w:t>— no figure within staleness window</w:t>
+            </w:r>
+          </w:p>
+        </w:tc>
+        <w:tc>
+          <w:tcPr>
+            <w:tcW w:type="dxa" w:w="1440"/>
+          </w:tcPr>
+          <w:p>
+            <w:r>
+              <w:t>13.00% (Low)</w:t>
+            </w:r>
+          </w:p>
+        </w:tc>
+        <w:tc>
+          <w:tcPr>
+            <w:tcW w:type="dxa" w:w="1440"/>
+          </w:tcPr>
+          <w:p>
+            <w:r>
+              <w:t>— no figure located in filings</w:t>
+            </w:r>
+          </w:p>
+        </w:tc>
+        <w:tc>
+          <w:tcPr>
+            <w:tcW w:type="dxa" w:w="1440"/>
+          </w:tcPr>
+          <w:p>
+            <w:r>
+              <w:t>— not reported at this basis</w:t>
+            </w:r>
+          </w:p>
+        </w:tc>
+      </w:tr>
+      <w:tr>
+        <w:tc>
+          <w:tcPr>
+            <w:tcW w:type="dxa" w:w="1440"/>
+          </w:tcPr>
+          <w:p>
+            <w:r>
+              <w:t>Non-accrual rate (% of portfolio, fair value)</w:t>
+            </w:r>
+          </w:p>
+        </w:tc>
+        <w:tc>
+          <w:tcPr>
+            <w:tcW w:type="dxa" w:w="1440"/>
+          </w:tcPr>
+          <w:p>
+            <w:r>
+              <w:t>— no figure located in filings</w:t>
+            </w:r>
+          </w:p>
+        </w:tc>
+        <w:tc>
+          <w:tcPr>
+            <w:tcW w:type="dxa" w:w="1440"/>
+          </w:tcPr>
+          <w:p>
+            <w:r>
+              <w:t>— no figure located in filings</w:t>
+            </w:r>
+          </w:p>
+        </w:tc>
+        <w:tc>
+          <w:tcPr>
+            <w:tcW w:type="dxa" w:w="1440"/>
+          </w:tcPr>
+          <w:p>
+            <w:r>
+              <w:t>— no figure located in filings</w:t>
+            </w:r>
+          </w:p>
+        </w:tc>
+        <w:tc>
+          <w:tcPr>
+            <w:tcW w:type="dxa" w:w="1440"/>
+          </w:tcPr>
+          <w:p>
+            <w:r>
+              <w:t>0.30% (Low)</w:t>
+            </w:r>
+          </w:p>
+        </w:tc>
+        <w:tc>
+          <w:tcPr>
+            <w:tcW w:type="dxa" w:w="1440"/>
+          </w:tcPr>
+          <w:p>
+            <w:r>
+              <w:t>— no figure located in filings</w:t>
+            </w:r>
+          </w:p>
+        </w:tc>
+      </w:tr>
+      <w:tr>
+        <w:tc>
+          <w:tcPr>
+            <w:tcW w:type="dxa" w:w="1440"/>
+          </w:tcPr>
+          <w:p>
+            <w:r>
+              <w:t>Non-accrual rate (% of portfolio, cost)</w:t>
+            </w:r>
+          </w:p>
+        </w:tc>
+        <w:tc>
+          <w:tcPr>
+            <w:tcW w:type="dxa" w:w="1440"/>
+          </w:tcPr>
+          <w:p>
+            <w:r>
+              <w:t>— no figure located in filings</w:t>
+            </w:r>
+          </w:p>
+        </w:tc>
+        <w:tc>
+          <w:tcPr>
+            <w:tcW w:type="dxa" w:w="1440"/>
+          </w:tcPr>
+          <w:p>
+            <w:r>
+              <w:t>— no figure located in filings</w:t>
+            </w:r>
+          </w:p>
+        </w:tc>
+        <w:tc>
+          <w:tcPr>
+            <w:tcW w:type="dxa" w:w="1440"/>
+          </w:tcPr>
+          <w:p>
+            <w:r>
+              <w:t>— no figure located in filings</w:t>
+            </w:r>
+          </w:p>
+        </w:tc>
+        <w:tc>
+          <w:tcPr>
+            <w:tcW w:type="dxa" w:w="1440"/>
+          </w:tcPr>
+          <w:p>
+            <w:r>
+              <w:t>0.60% (Low)</w:t>
+            </w:r>
+          </w:p>
+        </w:tc>
+        <w:tc>
+          <w:tcPr>
+            <w:tcW w:type="dxa" w:w="1440"/>
+          </w:tcPr>
+          <w:p>
+            <w:r>
+              <w:t>— no figure located in filings</w:t>
+            </w:r>
+          </w:p>
+        </w:tc>
+      </w:tr>
+      <w:tr>
+        <w:tc>
+          <w:tcPr>
+            <w:tcW w:type="dxa" w:w="1440"/>
+          </w:tcPr>
+          <w:p>
+            <w:r>
+              <w:t>Weighted average spread (bps)</w:t>
+            </w:r>
+          </w:p>
+        </w:tc>
+        <w:tc>
+          <w:tcPr>
+            <w:tcW w:type="dxa" w:w="1440"/>
+          </w:tcPr>
+          <w:p>
+            <w:r>
+              <w:t>— no figure located in filings</w:t>
+            </w:r>
+          </w:p>
+        </w:tc>
+        <w:tc>
+          <w:tcPr>
+            <w:tcW w:type="dxa" w:w="1440"/>
+          </w:tcPr>
+          <w:p>
+            <w:r>
+              <w:t>— no figure located in filings</w:t>
+            </w:r>
+          </w:p>
+        </w:tc>
+        <w:tc>
+          <w:tcPr>
+            <w:tcW w:type="dxa" w:w="1440"/>
+          </w:tcPr>
+          <w:p>
+            <w:r>
+              <w:t>— no figure located in filings</w:t>
+            </w:r>
+          </w:p>
+        </w:tc>
+        <w:tc>
+          <w:tcPr>
+            <w:tcW w:type="dxa" w:w="1440"/>
+          </w:tcPr>
+          <w:p>
+            <w:r>
+              <w:t>— no figure located in filings</w:t>
+            </w:r>
+          </w:p>
+        </w:tc>
+        <w:tc>
+          <w:tcPr>
+            <w:tcW w:type="dxa" w:w="1440"/>
+          </w:tcPr>
+          <w:p>
+            <w:r>
+              <w:t>— no figure located in filings</w:t>
+            </w:r>
+          </w:p>
+        </w:tc>
+      </w:tr>
     </w:tbl>
     <w:p>
       <w:r>
@@ -723,7 +971,7 @@
         <w:rPr>
           <w:sz w:val="20"/>
         </w:rPr>
-        <w:t>26 of 36 competitor cells are populated. Each empty cell is attributed below so it can be read as a known limit rather than an unexplained gap.</w:t>
+        <w:t>29 of 52 competitor cells are populated. Each empty cell is attributed below so it can be read as a known limit rather than an unexplained gap.</w:t>
       </w:r>
     </w:p>
     <w:p>
@@ -734,7 +982,139 @@
         <w:rPr>
           <w:sz w:val="20"/>
         </w:rPr>
-        <w:t>Exists, but outside the six-month staleness window (4)</w:t>
+        <w:t>Extraction we have not built (11)</w:t>
+      </w:r>
+    </w:p>
+    <w:p>
+      <w:pPr>
+        <w:pStyle w:val="ListBullet"/>
+      </w:pPr>
+      <w:r>
+        <w:rPr>
+          <w:sz w:val="20"/>
+        </w:rPr>
+        <w:t>CCLFX — Non-accrual rate (% of portfolio, cost): no EDGAR source located; either extraction we have not built, or the figure is not in the filings at all -- see the caveat below</w:t>
+      </w:r>
+    </w:p>
+    <w:p>
+      <w:pPr>
+        <w:pStyle w:val="ListBullet"/>
+      </w:pPr>
+      <w:r>
+        <w:rPr>
+          <w:sz w:val="20"/>
+        </w:rPr>
+        <w:t>CCLFX — Non-accrual rate (% of portfolio, fair value): no EDGAR source located; either extraction we have not built, or the figure is not in the filings at all -- see the caveat below</w:t>
+      </w:r>
+    </w:p>
+    <w:p>
+      <w:pPr>
+        <w:pStyle w:val="ListBullet"/>
+      </w:pPr>
+      <w:r>
+        <w:rPr>
+          <w:sz w:val="20"/>
+        </w:rPr>
+        <w:t>CCLFX — Weighted average spread (bps): no EDGAR source located; either extraction we have not built, or the figure is not in the filings at all -- see the caveat below</w:t>
+      </w:r>
+    </w:p>
+    <w:p>
+      <w:pPr>
+        <w:pStyle w:val="ListBullet"/>
+      </w:pPr>
+      <w:r>
+        <w:rPr>
+          <w:sz w:val="20"/>
+        </w:rPr>
+        <w:t>GBDC — Portfolio turnover: no EDGAR source located; either extraction we have not built, or the figure is not in the filings at all -- see the caveat below</w:t>
+      </w:r>
+    </w:p>
+    <w:p>
+      <w:pPr>
+        <w:pStyle w:val="ListBullet"/>
+      </w:pPr>
+      <w:r>
+        <w:rPr>
+          <w:sz w:val="20"/>
+        </w:rPr>
+        <w:t>GBDC — Weighted average spread (bps): no EDGAR source located; either extraction we have not built, or the figure is not in the filings at all -- see the caveat below</w:t>
+      </w:r>
+    </w:p>
+    <w:p>
+      <w:pPr>
+        <w:pStyle w:val="ListBullet"/>
+      </w:pPr>
+      <w:r>
+        <w:rPr>
+          <w:sz w:val="20"/>
+        </w:rPr>
+        <w:t>KREF — Non-accrual rate (% of portfolio, cost): no EDGAR source located; either extraction we have not built, or the figure is not in the filings at all -- see the caveat below</w:t>
+      </w:r>
+    </w:p>
+    <w:p>
+      <w:pPr>
+        <w:pStyle w:val="ListBullet"/>
+      </w:pPr>
+      <w:r>
+        <w:rPr>
+          <w:sz w:val="20"/>
+        </w:rPr>
+        <w:t>KREF — Non-accrual rate (% of portfolio, fair value): no EDGAR source located; either extraction we have not built, or the figure is not in the filings at all -- see the caveat below</w:t>
+      </w:r>
+    </w:p>
+    <w:p>
+      <w:pPr>
+        <w:pStyle w:val="ListBullet"/>
+      </w:pPr>
+      <w:r>
+        <w:rPr>
+          <w:sz w:val="20"/>
+        </w:rPr>
+        <w:t>KREF — Weighted average spread (bps): no EDGAR source located; either extraction we have not built, or the figure is not in the filings at all -- see the caveat below</w:t>
+      </w:r>
+    </w:p>
+    <w:p>
+      <w:pPr>
+        <w:pStyle w:val="ListBullet"/>
+      </w:pPr>
+      <w:r>
+        <w:rPr>
+          <w:sz w:val="20"/>
+        </w:rPr>
+        <w:t>TAKIX — Non-accrual rate (% of portfolio, cost): no EDGAR source located; either extraction we have not built, or the figure is not in the filings at all -- see the caveat below</w:t>
+      </w:r>
+    </w:p>
+    <w:p>
+      <w:pPr>
+        <w:pStyle w:val="ListBullet"/>
+      </w:pPr>
+      <w:r>
+        <w:rPr>
+          <w:sz w:val="20"/>
+        </w:rPr>
+        <w:t>TAKIX — Non-accrual rate (% of portfolio, fair value): no EDGAR source located; either extraction we have not built, or the figure is not in the filings at all -- see the caveat below</w:t>
+      </w:r>
+    </w:p>
+    <w:p>
+      <w:pPr>
+        <w:pStyle w:val="ListBullet"/>
+      </w:pPr>
+      <w:r>
+        <w:rPr>
+          <w:sz w:val="20"/>
+        </w:rPr>
+        <w:t>TAKIX — Weighted average spread (bps): no EDGAR source located; either extraction we have not built, or the figure is not in the filings at all -- see the caveat below</w:t>
+      </w:r>
+    </w:p>
+    <w:p>
+      <w:pPr>
+        <w:pStyle w:val="Heading2"/>
+      </w:pPr>
+      <w:r>
+        <w:rPr>
+          <w:sz w:val="20"/>
+        </w:rPr>
+        <w:t>Exists, but outside the six-month staleness window (5)</w:t>
       </w:r>
     </w:p>
     <w:p>
@@ -783,6 +1163,17 @@
     </w:p>
     <w:p>
       <w:pPr>
+        <w:pStyle w:val="ListBullet"/>
+      </w:pPr>
+      <w:r>
+        <w:rPr>
+          <w:sz w:val="20"/>
+        </w:rPr>
+        <w:t>CCLFX — Portfolio turnover: figure exists but predates the six-month line</w:t>
+      </w:r>
+    </w:p>
+    <w:p>
+      <w:pPr>
         <w:pStyle w:val="Heading2"/>
       </w:pPr>
       <w:r>
@@ -811,7 +1202,7 @@
         <w:rPr>
           <w:sz w:val="20"/>
         </w:rPr>
-        <w:t>Not published by the filer; no work would fix these (5)</w:t>
+        <w:t>Not published by the filer; no work would fix these (6)</w:t>
       </w:r>
     </w:p>
     <w:p>
@@ -867,6 +1258,17 @@
           <w:sz w:val="20"/>
         </w:rPr>
         <w:t>KREF — Net return, trailing 5Y (ann.): filer does not publish this concept; no extraction would fix it</w:t>
+      </w:r>
+    </w:p>
+    <w:p>
+      <w:pPr>
+        <w:pStyle w:val="ListBullet"/>
+      </w:pPr>
+      <w:r>
+        <w:rPr>
+          <w:sz w:val="20"/>
+        </w:rPr>
+        <w:t>KREF — Portfolio turnover: filer does not publish this concept; no extraction would fix it</w:t>
       </w:r>
     </w:p>
     <w:p>
@@ -1390,6 +1792,132 @@
           <w:p>
             <w:r>
               <w:t>9.22% (delta withheld)</w:t>
+            </w:r>
+          </w:p>
+        </w:tc>
+      </w:tr>
+      <w:tr>
+        <w:tc>
+          <w:tcPr>
+            <w:tcW w:type="dxa" w:w="2160"/>
+          </w:tcPr>
+          <w:p>
+            <w:r>
+              <w:t>Portfolio turnover</w:t>
+            </w:r>
+          </w:p>
+        </w:tc>
+        <w:tc>
+          <w:tcPr>
+            <w:tcW w:type="dxa" w:w="2160"/>
+          </w:tcPr>
+          <w:p>
+            <w:r>
+              <w:t>13.00%</w:t>
+            </w:r>
+          </w:p>
+        </w:tc>
+        <w:tc>
+          <w:tcPr>
+            <w:tcW w:type="dxa" w:w="2160"/>
+          </w:tcPr>
+          <w:p>
+            <w:r>
+              <w:t>13.00% – 13.00%</w:t>
+            </w:r>
+          </w:p>
+        </w:tc>
+        <w:tc>
+          <w:tcPr>
+            <w:tcW w:type="dxa" w:w="2160"/>
+          </w:tcPr>
+          <w:p>
+            <w:r>
+              <w:t>—</w:t>
+            </w:r>
+          </w:p>
+        </w:tc>
+      </w:tr>
+      <w:tr>
+        <w:tc>
+          <w:tcPr>
+            <w:tcW w:type="dxa" w:w="2160"/>
+          </w:tcPr>
+          <w:p>
+            <w:r>
+              <w:t>Non-accrual rate (% of portfolio, fair value)</w:t>
+            </w:r>
+          </w:p>
+        </w:tc>
+        <w:tc>
+          <w:tcPr>
+            <w:tcW w:type="dxa" w:w="2160"/>
+          </w:tcPr>
+          <w:p>
+            <w:r>
+              <w:t>0.30%</w:t>
+            </w:r>
+          </w:p>
+        </w:tc>
+        <w:tc>
+          <w:tcPr>
+            <w:tcW w:type="dxa" w:w="2160"/>
+          </w:tcPr>
+          <w:p>
+            <w:r>
+              <w:t>0.30% – 0.30%</w:t>
+            </w:r>
+          </w:p>
+        </w:tc>
+        <w:tc>
+          <w:tcPr>
+            <w:tcW w:type="dxa" w:w="2160"/>
+          </w:tcPr>
+          <w:p>
+            <w:r>
+              <w:t>—</w:t>
+            </w:r>
+          </w:p>
+        </w:tc>
+      </w:tr>
+      <w:tr>
+        <w:tc>
+          <w:tcPr>
+            <w:tcW w:type="dxa" w:w="2160"/>
+          </w:tcPr>
+          <w:p>
+            <w:r>
+              <w:t>Non-accrual rate (% of portfolio, cost)</w:t>
+            </w:r>
+          </w:p>
+        </w:tc>
+        <w:tc>
+          <w:tcPr>
+            <w:tcW w:type="dxa" w:w="2160"/>
+          </w:tcPr>
+          <w:p>
+            <w:r>
+              <w:t>0.60%</w:t>
+            </w:r>
+          </w:p>
+        </w:tc>
+        <w:tc>
+          <w:tcPr>
+            <w:tcW w:type="dxa" w:w="2160"/>
+          </w:tcPr>
+          <w:p>
+            <w:r>
+              <w:t>0.60% – 0.60%</w:t>
+            </w:r>
+          </w:p>
+        </w:tc>
+        <w:tc>
+          <w:tcPr>
+            <w:tcW w:type="dxa" w:w="2160"/>
+          </w:tcPr>
+          <w:p>
+            <w:r>
+              <w:t>—</w:t>
             </w:r>
           </w:p>
         </w:tc>
@@ -1991,6 +2519,48 @@
           </w:tcPr>
           <w:p>
             <w:r>
+              <w:t>TAKIX</w:t>
+            </w:r>
+          </w:p>
+        </w:tc>
+        <w:tc>
+          <w:tcPr>
+            <w:tcW w:type="dxa" w:w="2160"/>
+          </w:tcPr>
+          <w:p>
+            <w:r>
+              <w:t>Portfolio turnover</w:t>
+            </w:r>
+          </w:p>
+        </w:tc>
+        <w:tc>
+          <w:tcPr>
+            <w:tcW w:type="dxa" w:w="2160"/>
+          </w:tcPr>
+          <w:p>
+            <w:r>
+              <w:t>N-CSR, period 2025-12-31, acc. 0001725472-26-000003</w:t>
+            </w:r>
+          </w:p>
+        </w:tc>
+        <w:tc>
+          <w:tcPr>
+            <w:tcW w:type="dxa" w:w="2160"/>
+          </w:tcPr>
+          <w:p>
+            <w:r>
+              <w:t>financial highlights, CLASS I, row matching 'portfolio turnover', most recent column</w:t>
+            </w:r>
+          </w:p>
+        </w:tc>
+      </w:tr>
+      <w:tr>
+        <w:tc>
+          <w:tcPr>
+            <w:tcW w:type="dxa" w:w="2160"/>
+          </w:tcPr>
+          <w:p>
+            <w:r>
               <w:t>GBDC</w:t>
             </w:r>
           </w:p>
@@ -2316,6 +2886,90 @@
           <w:p>
             <w:r>
               <w:t>XBRL us-gaap:CommonStockDividendsPerShareDeclared [USD/shares] @ 2025-10-01..2025-12-31 (run-rate annualized)</w:t>
+            </w:r>
+          </w:p>
+        </w:tc>
+      </w:tr>
+      <w:tr>
+        <w:tc>
+          <w:tcPr>
+            <w:tcW w:type="dxa" w:w="2160"/>
+          </w:tcPr>
+          <w:p>
+            <w:r>
+              <w:t>GBDC</w:t>
+            </w:r>
+          </w:p>
+        </w:tc>
+        <w:tc>
+          <w:tcPr>
+            <w:tcW w:type="dxa" w:w="2160"/>
+          </w:tcPr>
+          <w:p>
+            <w:r>
+              <w:t>Non-accrual rate (% of portfolio, fair value)</w:t>
+            </w:r>
+          </w:p>
+        </w:tc>
+        <w:tc>
+          <w:tcPr>
+            <w:tcW w:type="dxa" w:w="2160"/>
+          </w:tcPr>
+          <w:p>
+            <w:r>
+              <w:t>10-K, period 2025-09-30, acc. 0001476765-25-000096</w:t>
+            </w:r>
+          </w:p>
+        </w:tc>
+        <w:tc>
+          <w:tcPr>
+            <w:tcW w:type="dxa" w:w="2160"/>
+          </w:tcPr>
+          <w:p>
+            <w:r>
+              <w:t>custom metric 'non_accrual_rate_fv_pct' @ char 4115622</w:t>
+            </w:r>
+          </w:p>
+        </w:tc>
+      </w:tr>
+      <w:tr>
+        <w:tc>
+          <w:tcPr>
+            <w:tcW w:type="dxa" w:w="2160"/>
+          </w:tcPr>
+          <w:p>
+            <w:r>
+              <w:t>GBDC</w:t>
+            </w:r>
+          </w:p>
+        </w:tc>
+        <w:tc>
+          <w:tcPr>
+            <w:tcW w:type="dxa" w:w="2160"/>
+          </w:tcPr>
+          <w:p>
+            <w:r>
+              <w:t>Non-accrual rate (% of portfolio, cost)</w:t>
+            </w:r>
+          </w:p>
+        </w:tc>
+        <w:tc>
+          <w:tcPr>
+            <w:tcW w:type="dxa" w:w="2160"/>
+          </w:tcPr>
+          <w:p>
+            <w:r>
+              <w:t>10-K, period 2025-09-30, acc. 0001476765-25-000096</w:t>
+            </w:r>
+          </w:p>
+        </w:tc>
+        <w:tc>
+          <w:tcPr>
+            <w:tcW w:type="dxa" w:w="2160"/>
+          </w:tcPr>
+          <w:p>
+            <w:r>
+              <w:t>custom metric 'non_accrual_rate_cost_pct' @ char 4115622</w:t>
             </w:r>
           </w:p>
         </w:tc>

</xml_diff>

<commit_message>
Regex-free metric definitions; shrink the last authorship question
A metric in a table needed only a row label, but a prose metric needed a regex
no PM would write -- which made "who authors definitions" a scoping question
rather than a preference. The `match` form closes that: name the phrase to look
beside, say what to take, bound how far to look. Demonstrated on total annual
expenses, which now extracts for two funds from a definition containing no
regex.

Supplying both `match` and `prose_patterns` is rejected: two ways to find the
same value is two ways to disagree about it.

Co-Authored-By: Claude Opus 5 <noreply@anthropic.com>
</commit_message>
<xml_diff>
--- a/output/benchmark_report.docx
+++ b/output/benchmark_report.docx
@@ -939,6 +939,68 @@
           </w:p>
         </w:tc>
       </w:tr>
+      <w:tr>
+        <w:tc>
+          <w:tcPr>
+            <w:tcW w:type="dxa" w:w="1440"/>
+          </w:tcPr>
+          <w:p>
+            <w:r>
+              <w:t>Total annual expenses</w:t>
+            </w:r>
+          </w:p>
+        </w:tc>
+        <w:tc>
+          <w:tcPr>
+            <w:tcW w:type="dxa" w:w="1440"/>
+          </w:tcPr>
+          <w:p>
+            <w:r>
+              <w:t>— no figure located in filings</w:t>
+            </w:r>
+          </w:p>
+        </w:tc>
+        <w:tc>
+          <w:tcPr>
+            <w:tcW w:type="dxa" w:w="1440"/>
+          </w:tcPr>
+          <w:p>
+            <w:r>
+              <w:t>3.27% (Med)</w:t>
+            </w:r>
+          </w:p>
+        </w:tc>
+        <w:tc>
+          <w:tcPr>
+            <w:tcW w:type="dxa" w:w="1440"/>
+          </w:tcPr>
+          <w:p>
+            <w:r>
+              <w:t>— no figure located in filings</w:t>
+            </w:r>
+          </w:p>
+        </w:tc>
+        <w:tc>
+          <w:tcPr>
+            <w:tcW w:type="dxa" w:w="1440"/>
+          </w:tcPr>
+          <w:p>
+            <w:r>
+              <w:t>11.77% (Low)</w:t>
+            </w:r>
+          </w:p>
+        </w:tc>
+        <w:tc>
+          <w:tcPr>
+            <w:tcW w:type="dxa" w:w="1440"/>
+          </w:tcPr>
+          <w:p>
+            <w:r>
+              <w:t>— no figure located in filings</w:t>
+            </w:r>
+          </w:p>
+        </w:tc>
+      </w:tr>
     </w:tbl>
     <w:p>
       <w:r>
@@ -971,7 +1033,7 @@
         <w:rPr>
           <w:sz w:val="20"/>
         </w:rPr>
-        <w:t>29 of 52 competitor cells are populated. Each empty cell is attributed below so it can be read as a known limit rather than an unexplained gap.</w:t>
+        <w:t>31 of 56 competitor cells are populated. Each empty cell is attributed below so it can be read as a known limit rather than an unexplained gap.</w:t>
       </w:r>
     </w:p>
     <w:p>
@@ -982,7 +1044,7 @@
         <w:rPr>
           <w:sz w:val="20"/>
         </w:rPr>
-        <w:t>Extraction we have not built (11)</w:t>
+        <w:t>Extraction we have not built (13)</w:t>
       </w:r>
     </w:p>
     <w:p>
@@ -1070,6 +1132,17 @@
         <w:rPr>
           <w:sz w:val="20"/>
         </w:rPr>
+        <w:t>KREF — Total annual expenses: no EDGAR source located; either extraction we have not built, or the figure is not in the filings at all -- see the caveat below</w:t>
+      </w:r>
+    </w:p>
+    <w:p>
+      <w:pPr>
+        <w:pStyle w:val="ListBullet"/>
+      </w:pPr>
+      <w:r>
+        <w:rPr>
+          <w:sz w:val="20"/>
+        </w:rPr>
         <w:t>KREF — Weighted average spread (bps): no EDGAR source located; either extraction we have not built, or the figure is not in the filings at all -- see the caveat below</w:t>
       </w:r>
     </w:p>
@@ -1093,6 +1166,17 @@
           <w:sz w:val="20"/>
         </w:rPr>
         <w:t>TAKIX — Non-accrual rate (% of portfolio, fair value): no EDGAR source located; either extraction we have not built, or the figure is not in the filings at all -- see the caveat below</w:t>
+      </w:r>
+    </w:p>
+    <w:p>
+      <w:pPr>
+        <w:pStyle w:val="ListBullet"/>
+      </w:pPr>
+      <w:r>
+        <w:rPr>
+          <w:sz w:val="20"/>
+        </w:rPr>
+        <w:t>TAKIX — Total annual expenses: no EDGAR source located; either extraction we have not built, or the figure is not in the filings at all -- see the caveat below</w:t>
       </w:r>
     </w:p>
     <w:p>
@@ -1324,6 +1408,24 @@
           <w:sz w:val="20"/>
         </w:rPr>
         <w:t>candidates 15, 20; resolved to 15 (text_pattern). kept 15: agreed on by 2 independent extraction(s) vs 20 (1); chosen source text_pattern, no flags</w:t>
+      </w:r>
+    </w:p>
+    <w:p>
+      <w:pPr>
+        <w:pStyle w:val="ListBullet"/>
+      </w:pPr>
+      <w:r>
+        <w:rPr>
+          <w:b/>
+          <w:sz w:val="20"/>
+        </w:rPr>
+        <w:t xml:space="preserve">GBDC — Total annual expenses: </w:t>
+      </w:r>
+      <w:r>
+        <w:rPr>
+          <w:sz w:val="20"/>
+        </w:rPr>
+        <w:t>candidates 11.77, 12.27; resolved to 11.77 (text_pattern). kept 11.77: agreed on by 1 independent extraction(s) vs 12.27 (1); chosen source text_pattern, no flags</w:t>
       </w:r>
     </w:p>
     <w:p>
@@ -1922,6 +2024,48 @@
           </w:p>
         </w:tc>
       </w:tr>
+      <w:tr>
+        <w:tc>
+          <w:tcPr>
+            <w:tcW w:type="dxa" w:w="2160"/>
+          </w:tcPr>
+          <w:p>
+            <w:r>
+              <w:t>Total annual expenses</w:t>
+            </w:r>
+          </w:p>
+        </w:tc>
+        <w:tc>
+          <w:tcPr>
+            <w:tcW w:type="dxa" w:w="2160"/>
+          </w:tcPr>
+          <w:p>
+            <w:r>
+              <w:t>7.52%</w:t>
+            </w:r>
+          </w:p>
+        </w:tc>
+        <w:tc>
+          <w:tcPr>
+            <w:tcW w:type="dxa" w:w="2160"/>
+          </w:tcPr>
+          <w:p>
+            <w:r>
+              <w:t>3.27% – 11.77%</w:t>
+            </w:r>
+          </w:p>
+        </w:tc>
+        <w:tc>
+          <w:tcPr>
+            <w:tcW w:type="dxa" w:w="2160"/>
+          </w:tcPr>
+          <w:p>
+            <w:r>
+              <w:t>—</w:t>
+            </w:r>
+          </w:p>
+        </w:tc>
+      </w:tr>
     </w:tbl>
     <w:p>
       <w:pPr>
@@ -2172,6 +2316,48 @@
           <w:p>
             <w:r>
               <w:t>N-PORT fundInfo/amtPay* (sum of borrowings)</w:t>
+            </w:r>
+          </w:p>
+        </w:tc>
+      </w:tr>
+      <w:tr>
+        <w:tc>
+          <w:tcPr>
+            <w:tcW w:type="dxa" w:w="2160"/>
+          </w:tcPr>
+          <w:p>
+            <w:r>
+              <w:t>CCLFX</w:t>
+            </w:r>
+          </w:p>
+        </w:tc>
+        <w:tc>
+          <w:tcPr>
+            <w:tcW w:type="dxa" w:w="2160"/>
+          </w:tcPr>
+          <w:p>
+            <w:r>
+              <w:t>Total annual expenses</w:t>
+            </w:r>
+          </w:p>
+        </w:tc>
+        <w:tc>
+          <w:tcPr>
+            <w:tcW w:type="dxa" w:w="2160"/>
+          </w:tcPr>
+          <w:p>
+            <w:r>
+              <w:t>424B3, period 2025-08-12, acc. 0001213900-25-074891</w:t>
+            </w:r>
+          </w:p>
+        </w:tc>
+        <w:tc>
+          <w:tcPr>
+            <w:tcW w:type="dxa" w:w="2160"/>
+          </w:tcPr>
+          <w:p>
+            <w:r>
+              <w:t>custom metric 'total_annual_expenses_pct' @ char 191520</w:t>
             </w:r>
           </w:p>
         </w:tc>
@@ -2981,6 +3167,48 @@
           </w:tcPr>
           <w:p>
             <w:r>
+              <w:t>GBDC</w:t>
+            </w:r>
+          </w:p>
+        </w:tc>
+        <w:tc>
+          <w:tcPr>
+            <w:tcW w:type="dxa" w:w="2160"/>
+          </w:tcPr>
+          <w:p>
+            <w:r>
+              <w:t>Total annual expenses</w:t>
+            </w:r>
+          </w:p>
+        </w:tc>
+        <w:tc>
+          <w:tcPr>
+            <w:tcW w:type="dxa" w:w="2160"/>
+          </w:tcPr>
+          <w:p>
+            <w:r>
+              <w:t>10-K, period 2025-09-30, acc. 0001476765-25-000096</w:t>
+            </w:r>
+          </w:p>
+        </w:tc>
+        <w:tc>
+          <w:tcPr>
+            <w:tcW w:type="dxa" w:w="2160"/>
+          </w:tcPr>
+          <w:p>
+            <w:r>
+              <w:t>custom metric 'total_annual_expenses_pct' @ char 3695567</w:t>
+            </w:r>
+          </w:p>
+        </w:tc>
+      </w:tr>
+      <w:tr>
+        <w:tc>
+          <w:tcPr>
+            <w:tcW w:type="dxa" w:w="2160"/>
+          </w:tcPr>
+          <w:p>
+            <w:r>
               <w:t>KREF</w:t>
             </w:r>
           </w:p>

</xml_diff>